<commit_message>
Rebuild customer grading skill v2.0 on authoritative screening rule docs
Restructure around the mandated three-step pipeline (customer type ->
intent grade -> purchase/follow-up priority) after fully reading the two
authoritative documents (customer persona & screening script library,
customer judgment & info collection SOP). Adds the 45-scenario screening
decision table and 13-scenario activation script library as a new
reference, hour-level follow-up cadence tables per grade, exact
upgrade/downgrade conditions per customer type, and marks the
old-customer reactivation matrix as a documented extension of official
rules. Word usage guide updated to v2 with the underlying-logic chapter.

Co-Authored-By: Claude Fable 5 <noreply@anthropic.com>
Claude-Session: https://claude.ai/code/session_01Ahm9ntGLpgeB4ALHtSdzQa
</commit_message>
<xml_diff>
--- a/king-customer-grading/King客户评级Skill-使用说明.docx
+++ b/king-customer-grading/King客户评级Skill-使用说明.docx
@@ -35,7 +35,21 @@
           <w:color w:val="8A6414"/>
           <w:sz w:val="36"/>
         </w:rPr>
-        <w:t>使用说明</w:t>
+        <w:t>使用说明 · 三步筛选法</w:t>
+      </w:r>
+    </w:p>
+    <w:p>
+      <w:pPr>
+        <w:spacing w:after="80"/>
+        <w:jc w:val="center"/>
+      </w:pPr>
+      <w:r>
+        <w:rPr>
+          <w:rFonts w:ascii="Calibri" w:hAnsi="Calibri" w:eastAsia="微软雅黑"/>
+          <w:b w:val="0"/>
+          <w:sz w:val="24"/>
+        </w:rPr>
+        <w:t>先分客户类型 → 再评意向等级 → 再定采购优先级</w:t>
       </w:r>
     </w:p>
     <w:p>
@@ -64,7 +78,7 @@
           <w:color w:val="595959"/>
           <w:sz w:val="20"/>
         </w:rPr>
-        <w:t>版本 v1.0　|　2026 年 7 月 6 日　|　基于 King 销冠孵化器分级体系</w:t>
+        <w:t>版本 v2.0　|　2026 年 7 月 6 日　|　依据《客户画像及客户筛选话术库》《客户判断与信息收集SOP》</w:t>
       </w:r>
     </w:p>
     <w:p>
@@ -77,7 +91,7 @@
         <w:pStyle w:val="Heading1"/>
       </w:pPr>
       <w:r>
-        <w:t>一、这是什么</w:t>
+        <w:t>一、底层逻辑：为什么是这个顺序</w:t>
       </w:r>
     </w:p>
     <w:p>
@@ -89,7 +103,7 @@
           <w:rFonts w:ascii="Calibri" w:hAnsi="Calibri" w:eastAsia="微软雅黑"/>
           <w:b w:val="0"/>
         </w:rPr>
-        <w:t>一个独立的客户评级 AI 技能：把客户的聊天记录或资料输入进去（一个或一批、新客户或老客户都行），AI 按照公司知识库的分级标准输出：成交距离等级、客户类型、标准标签串、评级依据、还缺什么信息、建议下一步做什么、按什么节奏跟进。</w:t>
+        <w:t>公司 SOP 的第一句话就是答案：销售拿到客户，第一件事不是发目录、不是报价，是判断客户。判断客户不是看客户嘴上说得多好，而是看客户是否愿意提供关键信息，以及这些信息能不能证明客户有真实采购可能。</w:t>
       </w:r>
     </w:p>
     <w:p>
@@ -99,9 +113,78 @@
       <w:r>
         <w:rPr>
           <w:rFonts w:ascii="Calibri" w:hAnsi="Calibri" w:eastAsia="微软雅黑"/>
-          <w:b w:val="0"/>
+          <w:b/>
         </w:rPr>
-        <w:t>它和自动回复 Skill 是两个独立的技能：自动回复负责"聊"，评级负责"筛"。可以单独用，也可以配合用——聊完的对话定期喂给评级技能重评，评级结果写回客户标签，让销售把时间花在对的人身上。</w:t>
+        <w:t>评级必须严格按三步走，顺序不能乱：</w:t>
+      </w:r>
+    </w:p>
+    <w:p>
+      <w:pPr>
+        <w:pStyle w:val="ListBullet"/>
+        <w:spacing w:after="60"/>
+      </w:pPr>
+      <w:r>
+        <w:rPr>
+          <w:rFonts w:ascii="Calibri" w:hAnsi="Calibri" w:eastAsia="微软雅黑"/>
+          <w:b/>
+        </w:rPr>
+        <w:t>第一步先分类型（客户是谁）</w:t>
+      </w:r>
+      <w:r>
+        <w:rPr>
+          <w:rFonts w:ascii="Calibri" w:hAnsi="Calibri" w:eastAsia="微软雅黑"/>
+        </w:rPr>
+        <w:t>，因为不同类型的客户关注点完全不同：C端个人看"送到家总价、能不能住"；B端项目看"能不能落地、能不能赚钱、能不能按期开业"；代理商看"样品、展厅、政策、长期合作"；中间商看"客户会不会被抢、有没有利润"；建筑商看"地基、安装、水电"。类型判断错，后面的评级标准、要收集的资料、推进动作全都会错。</w:t>
+      </w:r>
+    </w:p>
+    <w:p>
+      <w:pPr>
+        <w:pStyle w:val="ListBullet"/>
+        <w:spacing w:after="60"/>
+      </w:pPr>
+      <w:r>
+        <w:rPr>
+          <w:rFonts w:ascii="Calibri" w:hAnsi="Calibri" w:eastAsia="微软雅黑"/>
+          <w:b/>
+        </w:rPr>
+        <w:t>第二步在类型内评意向等级（值不值得跟）</w:t>
+      </w:r>
+      <w:r>
+        <w:rPr>
+          <w:rFonts w:ascii="Calibri" w:hAnsi="Calibri" w:eastAsia="微软雅黑"/>
+        </w:rPr>
+        <w:t>，因为每一类客户有自己独立的 A/B/C/D 判断标准——同样是"要买3套"，对民宿客户可能是 A 级，对不肯说终端客户的中间商连 B 都够不上。等级只有放在类型里才有意义。</w:t>
+      </w:r>
+    </w:p>
+    <w:p>
+      <w:pPr>
+        <w:pStyle w:val="ListBullet"/>
+        <w:spacing w:after="60"/>
+      </w:pPr>
+      <w:r>
+        <w:rPr>
+          <w:rFonts w:ascii="Calibri" w:hAnsi="Calibri" w:eastAsia="微软雅黑"/>
+          <w:b/>
+        </w:rPr>
+        <w:t>第三步定采购优先级（谁先跟、怎么跟）</w:t>
+      </w:r>
+      <w:r>
+        <w:rPr>
+          <w:rFonts w:ascii="Calibri" w:hAnsi="Calibri" w:eastAsia="微软雅黑"/>
+        </w:rPr>
+        <w:t>，等级决定谁先被跟进、投入多少：A 级 15 分钟内响应、当天推进；B 级培养；C 级助理标准跟进；D 级归档不投入；S 级记录唤醒节点等时机。销售的时间是最贵的资源，评级的最终目的就是把时间分配对。</w:t>
+      </w:r>
+    </w:p>
+    <w:p>
+      <w:pPr>
+        <w:spacing w:after="120"/>
+      </w:pPr>
+      <w:r>
+        <w:rPr>
+          <w:rFonts w:ascii="Calibri" w:hAnsi="Calibri" w:eastAsia="微软雅黑"/>
+          <w:b/>
+        </w:rPr>
+        <w:t>一句话总结底层逻辑：先搞清"他是谁"，才能用对尺子量"他有多真"，量完才知道"该花多少力气跟他"。</w:t>
       </w:r>
     </w:p>
     <w:p>
@@ -109,7 +192,19 @@
         <w:pStyle w:val="Heading1"/>
       </w:pPr>
       <w:r>
-        <w:t>二、等级速查表</w:t>
+        <w:t>二、三步法怎么运转</w:t>
+      </w:r>
+    </w:p>
+    <w:p>
+      <w:pPr>
+        <w:spacing w:after="120"/>
+      </w:pPr>
+      <w:r>
+        <w:rPr>
+          <w:rFonts w:ascii="Calibri" w:hAnsi="Calibri" w:eastAsia="微软雅黑"/>
+          <w:b/>
+        </w:rPr>
+        <w:t>第一步：区分六类客户</w:t>
       </w:r>
     </w:p>
     <w:tbl>
@@ -126,7 +221,381 @@
       <w:tr>
         <w:tc>
           <w:tcPr>
-            <w:tcW w:type="dxa" w:w="1247"/>
+            <w:tcW w:type="dxa" w:w="2551"/>
+          </w:tcPr>
+          <w:p>
+            <w:r/>
+            <w:r>
+              <w:rPr>
+                <w:rFonts w:ascii="Calibri" w:hAnsi="Calibri" w:eastAsia="微软雅黑"/>
+                <w:b/>
+                <w:sz w:val="20"/>
+              </w:rPr>
+              <w:t>类型</w:t>
+            </w:r>
+          </w:p>
+        </w:tc>
+        <w:tc>
+          <w:tcPr>
+            <w:tcW w:type="dxa" w:w="3969"/>
+          </w:tcPr>
+          <w:p>
+            <w:r/>
+            <w:r>
+              <w:rPr>
+                <w:rFonts w:ascii="Calibri" w:hAnsi="Calibri" w:eastAsia="微软雅黑"/>
+                <w:b/>
+                <w:sz w:val="20"/>
+              </w:rPr>
+              <w:t>识别要点</w:t>
+            </w:r>
+          </w:p>
+        </w:tc>
+        <w:tc>
+          <w:tcPr>
+            <w:tcW w:type="dxa" w:w="3685"/>
+          </w:tcPr>
+          <w:p>
+            <w:r/>
+            <w:r>
+              <w:rPr>
+                <w:rFonts w:ascii="Calibri" w:hAnsi="Calibri" w:eastAsia="微软雅黑"/>
+                <w:b/>
+                <w:sz w:val="20"/>
+              </w:rPr>
+              <w:t>最关心什么</w:t>
+            </w:r>
+          </w:p>
+        </w:tc>
+      </w:tr>
+      <w:tr>
+        <w:tc>
+          <w:tcPr>
+            <w:tcW w:type="dxa" w:w="2551"/>
+          </w:tcPr>
+          <w:p>
+            <w:r/>
+            <w:r>
+              <w:rPr>
+                <w:rFonts w:ascii="Calibri" w:hAnsi="Calibri" w:eastAsia="微软雅黑"/>
+                <w:sz w:val="19"/>
+              </w:rPr>
+              <w:t>代理商/经销商</w:t>
+            </w:r>
+          </w:p>
+        </w:tc>
+        <w:tc>
+          <w:tcPr>
+            <w:tcW w:type="dxa" w:w="3969"/>
+          </w:tcPr>
+          <w:p>
+            <w:r/>
+            <w:r>
+              <w:rPr>
+                <w:rFonts w:ascii="Calibri" w:hAnsi="Calibri" w:eastAsia="微软雅黑"/>
+                <w:sz w:val="19"/>
+              </w:rPr>
+              <w:t>说要卖我们的产品、问代理政策、有店/展厅/渠道</w:t>
+            </w:r>
+          </w:p>
+        </w:tc>
+        <w:tc>
+          <w:tcPr>
+            <w:tcW w:type="dxa" w:w="3685"/>
+          </w:tcPr>
+          <w:p>
+            <w:r/>
+            <w:r>
+              <w:rPr>
+                <w:rFonts w:ascii="Calibri" w:hAnsi="Calibri" w:eastAsia="微软雅黑"/>
+                <w:sz w:val="19"/>
+              </w:rPr>
+              <w:t>样品、展厅、政策、长期合作</w:t>
+            </w:r>
+          </w:p>
+        </w:tc>
+      </w:tr>
+      <w:tr>
+        <w:tc>
+          <w:tcPr>
+            <w:tcW w:type="dxa" w:w="2551"/>
+          </w:tcPr>
+          <w:p>
+            <w:r/>
+            <w:r>
+              <w:rPr>
+                <w:rFonts w:ascii="Calibri" w:hAnsi="Calibri" w:eastAsia="微软雅黑"/>
+                <w:sz w:val="19"/>
+              </w:rPr>
+              <w:t>民宿/营地/酒店项目(B端)</w:t>
+            </w:r>
+          </w:p>
+        </w:tc>
+        <w:tc>
+          <w:tcPr>
+            <w:tcW w:type="dxa" w:w="3969"/>
+          </w:tcPr>
+          <w:p>
+            <w:r/>
+            <w:r>
+              <w:rPr>
+                <w:rFonts w:ascii="Calibri" w:hAnsi="Calibri" w:eastAsia="微软雅黑"/>
+                <w:sz w:val="19"/>
+              </w:rPr>
+              <w:t>做住宿生意、说项目、谈多套</w:t>
+            </w:r>
+          </w:p>
+        </w:tc>
+        <w:tc>
+          <w:tcPr>
+            <w:tcW w:type="dxa" w:w="3685"/>
+          </w:tcPr>
+          <w:p>
+            <w:r/>
+            <w:r>
+              <w:rPr>
+                <w:rFonts w:ascii="Calibri" w:hAnsi="Calibri" w:eastAsia="微软雅黑"/>
+                <w:sz w:val="19"/>
+              </w:rPr>
+              <w:t>落地、赚钱、按期开业、批量复制</w:t>
+            </w:r>
+          </w:p>
+        </w:tc>
+      </w:tr>
+      <w:tr>
+        <w:tc>
+          <w:tcPr>
+            <w:tcW w:type="dxa" w:w="2551"/>
+          </w:tcPr>
+          <w:p>
+            <w:r/>
+            <w:r>
+              <w:rPr>
+                <w:rFonts w:ascii="Calibri" w:hAnsi="Calibri" w:eastAsia="微软雅黑"/>
+                <w:sz w:val="19"/>
+              </w:rPr>
+              <w:t>建筑商/安装商</w:t>
+            </w:r>
+          </w:p>
+        </w:tc>
+        <w:tc>
+          <w:tcPr>
+            <w:tcW w:type="dxa" w:w="3969"/>
+          </w:tcPr>
+          <w:p>
+            <w:r/>
+            <w:r>
+              <w:rPr>
+                <w:rFonts w:ascii="Calibri" w:hAnsi="Calibri" w:eastAsia="微软雅黑"/>
+                <w:sz w:val="19"/>
+              </w:rPr>
+              <w:t>有施工安装能力（需二次判断实际角色）</w:t>
+            </w:r>
+          </w:p>
+        </w:tc>
+        <w:tc>
+          <w:tcPr>
+            <w:tcW w:type="dxa" w:w="3685"/>
+          </w:tcPr>
+          <w:p>
+            <w:r/>
+            <w:r>
+              <w:rPr>
+                <w:rFonts w:ascii="Calibri" w:hAnsi="Calibri" w:eastAsia="微软雅黑"/>
+                <w:sz w:val="19"/>
+              </w:rPr>
+              <w:t>地基、安装、水电、本地工人</w:t>
+            </w:r>
+          </w:p>
+        </w:tc>
+      </w:tr>
+      <w:tr>
+        <w:tc>
+          <w:tcPr>
+            <w:tcW w:type="dxa" w:w="2551"/>
+          </w:tcPr>
+          <w:p>
+            <w:r/>
+            <w:r>
+              <w:rPr>
+                <w:rFonts w:ascii="Calibri" w:hAnsi="Calibri" w:eastAsia="微软雅黑"/>
+                <w:sz w:val="19"/>
+              </w:rPr>
+              <w:t>个人业主(C端)</w:t>
+            </w:r>
+          </w:p>
+        </w:tc>
+        <w:tc>
+          <w:tcPr>
+            <w:tcW w:type="dxa" w:w="3969"/>
+          </w:tcPr>
+          <w:p>
+            <w:r/>
+            <w:r>
+              <w:rPr>
+                <w:rFonts w:ascii="Calibri" w:hAnsi="Calibri" w:eastAsia="微软雅黑"/>
+                <w:sz w:val="19"/>
+              </w:rPr>
+              <w:t>自住/后院/农场/度假</w:t>
+            </w:r>
+          </w:p>
+        </w:tc>
+        <w:tc>
+          <w:tcPr>
+            <w:tcW w:type="dxa" w:w="3685"/>
+          </w:tcPr>
+          <w:p>
+            <w:r/>
+            <w:r>
+              <w:rPr>
+                <w:rFonts w:ascii="Calibri" w:hAnsi="Calibri" w:eastAsia="微软雅黑"/>
+                <w:sz w:val="19"/>
+              </w:rPr>
+              <w:t>总价、运费、安装、会不会被骗</w:t>
+            </w:r>
+          </w:p>
+        </w:tc>
+      </w:tr>
+      <w:tr>
+        <w:tc>
+          <w:tcPr>
+            <w:tcW w:type="dxa" w:w="2551"/>
+          </w:tcPr>
+          <w:p>
+            <w:r/>
+            <w:r>
+              <w:rPr>
+                <w:rFonts w:ascii="Calibri" w:hAnsi="Calibri" w:eastAsia="微软雅黑"/>
+                <w:sz w:val="19"/>
+              </w:rPr>
+              <w:t>华人客户/中间人</w:t>
+            </w:r>
+          </w:p>
+        </w:tc>
+        <w:tc>
+          <w:tcPr>
+            <w:tcW w:type="dxa" w:w="3969"/>
+          </w:tcPr>
+          <w:p>
+            <w:r/>
+            <w:r>
+              <w:rPr>
+                <w:rFonts w:ascii="Calibri" w:hAnsi="Calibri" w:eastAsia="微软雅黑"/>
+                <w:sz w:val="19"/>
+              </w:rPr>
+              <w:t>华语沟通、常代终端问</w:t>
+            </w:r>
+          </w:p>
+        </w:tc>
+        <w:tc>
+          <w:tcPr>
+            <w:tcW w:type="dxa" w:w="3685"/>
+          </w:tcPr>
+          <w:p>
+            <w:r/>
+            <w:r>
+              <w:rPr>
+                <w:rFonts w:ascii="Calibri" w:hAnsi="Calibri" w:eastAsia="微软雅黑"/>
+                <w:sz w:val="19"/>
+              </w:rPr>
+              <w:t>资源变现、客户保护</w:t>
+            </w:r>
+          </w:p>
+        </w:tc>
+      </w:tr>
+      <w:tr>
+        <w:tc>
+          <w:tcPr>
+            <w:tcW w:type="dxa" w:w="2551"/>
+          </w:tcPr>
+          <w:p>
+            <w:r/>
+            <w:r>
+              <w:rPr>
+                <w:rFonts w:ascii="Calibri" w:hAnsi="Calibri" w:eastAsia="微软雅黑"/>
+                <w:sz w:val="19"/>
+              </w:rPr>
+              <w:t>普通中间商/采购代理</w:t>
+            </w:r>
+          </w:p>
+        </w:tc>
+        <w:tc>
+          <w:tcPr>
+            <w:tcW w:type="dxa" w:w="3969"/>
+          </w:tcPr>
+          <w:p>
+            <w:r/>
+            <w:r>
+              <w:rPr>
+                <w:rFonts w:ascii="Calibri" w:hAnsi="Calibri" w:eastAsia="微软雅黑"/>
+                <w:sz w:val="19"/>
+              </w:rPr>
+              <w:t>帮客户找产品</w:t>
+            </w:r>
+          </w:p>
+        </w:tc>
+        <w:tc>
+          <w:tcPr>
+            <w:tcW w:type="dxa" w:w="3685"/>
+          </w:tcPr>
+          <w:p>
+            <w:r/>
+            <w:r>
+              <w:rPr>
+                <w:rFonts w:ascii="Calibri" w:hAnsi="Calibri" w:eastAsia="微软雅黑"/>
+                <w:sz w:val="19"/>
+              </w:rPr>
+              <w:t>客户保护、利润、能否协助成交</w:t>
+            </w:r>
+          </w:p>
+        </w:tc>
+      </w:tr>
+    </w:tbl>
+    <w:p>
+      <w:pPr>
+        <w:spacing w:after="40"/>
+      </w:pPr>
+    </w:p>
+    <w:p>
+      <w:pPr>
+        <w:spacing w:after="120"/>
+      </w:pPr>
+      <w:r>
+        <w:rPr>
+          <w:rFonts w:ascii="Calibri" w:hAnsi="Calibri" w:eastAsia="微软雅黑"/>
+          <w:b w:val="0"/>
+          <w:color w:val="595959"/>
+        </w:rPr>
+        <w:t>特别规则：建筑商必须二次判断（帮人安装→按中间商；有客户资源→按代理商候选；自己开发→按B端）；华人客户不天然当重点。</w:t>
+      </w:r>
+    </w:p>
+    <w:p>
+      <w:pPr>
+        <w:spacing w:after="120"/>
+      </w:pPr>
+      <w:r>
+        <w:rPr>
+          <w:rFonts w:ascii="Calibri" w:hAnsi="Calibri" w:eastAsia="微软雅黑"/>
+          <w:b/>
+        </w:rPr>
+        <w:t>第二步：类型内评等级</w:t>
+      </w:r>
+    </w:p>
+    <w:tbl>
+      <w:tblPr>
+        <w:tblStyle w:val="LightGrid-Accent1"/>
+        <w:tblW w:type="auto" w:w="0"/>
+        <w:tblLook w:firstColumn="1" w:firstRow="1" w:lastColumn="0" w:lastRow="0" w:noHBand="0" w:noVBand="1" w:val="04A0"/>
+      </w:tblPr>
+      <w:tblGrid>
+        <w:gridCol w:w="2880"/>
+        <w:gridCol w:w="2880"/>
+        <w:gridCol w:w="2880"/>
+      </w:tblGrid>
+      <w:tr>
+        <w:tc>
+          <w:tcPr>
+            <w:tcW w:type="dxa" w:w="1701"/>
           </w:tcPr>
           <w:p>
             <w:r/>
@@ -142,7 +611,7 @@
         </w:tc>
         <w:tc>
           <w:tcPr>
-            <w:tcW w:type="dxa" w:w="5272"/>
+            <w:tcW w:type="dxa" w:w="5386"/>
           </w:tcPr>
           <w:p>
             <w:r/>
@@ -158,7 +627,7 @@
         </w:tc>
         <w:tc>
           <w:tcPr>
-            <w:tcW w:type="dxa" w:w="3402"/>
+            <w:tcW w:type="dxa" w:w="3118"/>
           </w:tcPr>
           <w:p>
             <w:r/>
@@ -168,7 +637,7 @@
                 <w:b/>
                 <w:sz w:val="20"/>
               </w:rPr>
-              <w:t>怎么处理</w:t>
+              <w:t>处理</w:t>
             </w:r>
           </w:p>
         </w:tc>
@@ -176,7 +645,7 @@
       <w:tr>
         <w:tc>
           <w:tcPr>
-            <w:tcW w:type="dxa" w:w="1247"/>
+            <w:tcW w:type="dxa" w:w="1701"/>
           </w:tcPr>
           <w:p>
             <w:r/>
@@ -185,13 +654,13 @@
                 <w:rFonts w:ascii="Calibri" w:hAnsi="Calibri" w:eastAsia="微软雅黑"/>
                 <w:sz w:val="19"/>
               </w:rPr>
-              <w:t>A/柜</w:t>
+              <w:t>A / A柜</w:t>
             </w:r>
           </w:p>
         </w:tc>
         <w:tc>
           <w:tcPr>
-            <w:tcW w:type="dxa" w:w="5272"/>
+            <w:tcW w:type="dxa" w:w="5386"/>
           </w:tcPr>
           <w:p>
             <w:r/>
@@ -200,13 +669,13 @@
                 <w:rFonts w:ascii="Calibri" w:hAnsi="Calibri" w:eastAsia="微软雅黑"/>
                 <w:sz w:val="19"/>
               </w:rPr>
-              <w:t>5套以上或整柜批量的高意向大单</w:t>
+              <w:t>类型内信息齐全的重点客户 / 5套以上批量</w:t>
             </w:r>
           </w:p>
         </w:tc>
         <w:tc>
           <w:tcPr>
-            <w:tcW w:type="dxa" w:w="3402"/>
+            <w:tcW w:type="dxa" w:w="3118"/>
           </w:tcPr>
           <w:p>
             <w:r/>
@@ -215,7 +684,7 @@
                 <w:rFonts w:ascii="Calibri" w:hAnsi="Calibri" w:eastAsia="微软雅黑"/>
                 <w:sz w:val="19"/>
               </w:rPr>
-              <w:t>最高优先级，必要时老板介入</w:t>
+              <w:t>立刻分配销售，置顶标星</w:t>
             </w:r>
           </w:p>
         </w:tc>
@@ -223,54 +692,7 @@
       <w:tr>
         <w:tc>
           <w:tcPr>
-            <w:tcW w:type="dxa" w:w="1247"/>
-          </w:tcPr>
-          <w:p>
-            <w:r/>
-            <w:r>
-              <w:rPr>
-                <w:rFonts w:ascii="Calibri" w:hAnsi="Calibri" w:eastAsia="微软雅黑"/>
-                <w:sz w:val="19"/>
-              </w:rPr>
-              <w:t>A</w:t>
-            </w:r>
-          </w:p>
-        </w:tc>
-        <w:tc>
-          <w:tcPr>
-            <w:tcW w:type="dxa" w:w="5272"/>
-          </w:tcPr>
-          <w:p>
-            <w:r/>
-            <w:r>
-              <w:rPr>
-                <w:rFonts w:ascii="Calibri" w:hAnsi="Calibri" w:eastAsia="微软雅黑"/>
-                <w:sz w:val="19"/>
-              </w:rPr>
-              <w:t>信息齐全的重点客户（国家/用途/数量/时间/预算/落地能力都清楚）</w:t>
-            </w:r>
-          </w:p>
-        </w:tc>
-        <w:tc>
-          <w:tcPr>
-            <w:tcW w:type="dxa" w:w="3402"/>
-          </w:tcPr>
-          <w:p>
-            <w:r/>
-            <w:r>
-              <w:rPr>
-                <w:rFonts w:ascii="Calibri" w:hAnsi="Calibri" w:eastAsia="微软雅黑"/>
-                <w:sz w:val="19"/>
-              </w:rPr>
-              <w:t>立刻分配销售，15分钟内回复，当天推进</w:t>
-            </w:r>
-          </w:p>
-        </w:tc>
-      </w:tr>
-      <w:tr>
-        <w:tc>
-          <w:tcPr>
-            <w:tcW w:type="dxa" w:w="1247"/>
+            <w:tcW w:type="dxa" w:w="1701"/>
           </w:tcPr>
           <w:p>
             <w:r/>
@@ -285,7 +707,7 @@
         </w:tc>
         <w:tc>
           <w:tcPr>
-            <w:tcW w:type="dxa" w:w="5272"/>
+            <w:tcW w:type="dxa" w:w="5386"/>
           </w:tcPr>
           <w:p>
             <w:r/>
@@ -294,13 +716,13 @@
                 <w:rFonts w:ascii="Calibri" w:hAnsi="Calibri" w:eastAsia="微软雅黑"/>
                 <w:sz w:val="19"/>
               </w:rPr>
-              <w:t>用途明确但预算/时间/进口/安装未确认的潜在客户</w:t>
+              <w:t>用途明确但预算/时间/进口/安装未确认</w:t>
             </w:r>
           </w:p>
         </w:tc>
         <w:tc>
           <w:tcPr>
-            <w:tcW w:type="dxa" w:w="3402"/>
+            <w:tcW w:type="dxa" w:w="3118"/>
           </w:tcPr>
           <w:p>
             <w:r/>
@@ -309,7 +731,7 @@
                 <w:rFonts w:ascii="Calibri" w:hAnsi="Calibri" w:eastAsia="微软雅黑"/>
                 <w:sz w:val="19"/>
               </w:rPr>
-              <w:t>分配培养，1/3/7/14天递进跟进</w:t>
+              <w:t>分配培养</w:t>
             </w:r>
           </w:p>
         </w:tc>
@@ -317,7 +739,7 @@
       <w:tr>
         <w:tc>
           <w:tcPr>
-            <w:tcW w:type="dxa" w:w="1247"/>
+            <w:tcW w:type="dxa" w:w="1701"/>
           </w:tcPr>
           <w:p>
             <w:r/>
@@ -332,7 +754,7 @@
         </w:tc>
         <w:tc>
           <w:tcPr>
-            <w:tcW w:type="dxa" w:w="5272"/>
+            <w:tcW w:type="dxa" w:w="5386"/>
           </w:tcPr>
           <w:p>
             <w:r/>
@@ -341,13 +763,13 @@
                 <w:rFonts w:ascii="Calibri" w:hAnsi="Calibri" w:eastAsia="微软雅黑"/>
                 <w:sz w:val="19"/>
               </w:rPr>
-              <w:t>有兴趣但信息不全的普通咨询</w:t>
+              <w:t>有兴趣但信息不全</w:t>
             </w:r>
           </w:p>
         </w:tc>
         <w:tc>
           <w:tcPr>
-            <w:tcW w:type="dxa" w:w="3402"/>
+            <w:tcW w:type="dxa" w:w="3118"/>
           </w:tcPr>
           <w:p>
             <w:r/>
@@ -356,7 +778,7 @@
                 <w:rFonts w:ascii="Calibri" w:hAnsi="Calibri" w:eastAsia="微软雅黑"/>
                 <w:sz w:val="19"/>
               </w:rPr>
-              <w:t>继续收集信息，低频维护</w:t>
+              <w:t>助理标准回复，继续收集</w:t>
             </w:r>
           </w:p>
         </w:tc>
@@ -364,7 +786,7 @@
       <w:tr>
         <w:tc>
           <w:tcPr>
-            <w:tcW w:type="dxa" w:w="1247"/>
+            <w:tcW w:type="dxa" w:w="1701"/>
           </w:tcPr>
           <w:p>
             <w:r/>
@@ -379,7 +801,7 @@
         </w:tc>
         <w:tc>
           <w:tcPr>
-            <w:tcW w:type="dxa" w:w="5272"/>
+            <w:tcW w:type="dxa" w:w="5386"/>
           </w:tcPr>
           <w:p>
             <w:r/>
@@ -388,13 +810,13 @@
                 <w:rFonts w:ascii="Calibri" w:hAnsi="Calibri" w:eastAsia="微软雅黑"/>
                 <w:sz w:val="19"/>
               </w:rPr>
-              <w:t>只问价不给信息、套资料、要账期、要独家不下样板</w:t>
+              <w:t>只问价/套资料/要账期/要独家不下样板</w:t>
             </w:r>
           </w:p>
         </w:tc>
         <w:tc>
           <w:tcPr>
-            <w:tcW w:type="dxa" w:w="3402"/>
+            <w:tcW w:type="dxa" w:w="3118"/>
           </w:tcPr>
           <w:p>
             <w:r/>
@@ -403,7 +825,7 @@
                 <w:rFonts w:ascii="Calibri" w:hAnsi="Calibri" w:eastAsia="微软雅黑"/>
                 <w:sz w:val="19"/>
               </w:rPr>
-              <w:t>标准回复后归档，不投入</w:t>
+              <w:t>标准回复后归档</w:t>
             </w:r>
           </w:p>
         </w:tc>
@@ -411,7 +833,7 @@
       <w:tr>
         <w:tc>
           <w:tcPr>
-            <w:tcW w:type="dxa" w:w="1247"/>
+            <w:tcW w:type="dxa" w:w="1701"/>
           </w:tcPr>
           <w:p>
             <w:r/>
@@ -426,7 +848,7 @@
         </w:tc>
         <w:tc>
           <w:tcPr>
-            <w:tcW w:type="dxa" w:w="5272"/>
+            <w:tcW w:type="dxa" w:w="5386"/>
           </w:tcPr>
           <w:p>
             <w:r/>
@@ -435,13 +857,13 @@
                 <w:rFonts w:ascii="Calibri" w:hAnsi="Calibri" w:eastAsia="微软雅黑"/>
                 <w:sz w:val="19"/>
               </w:rPr>
-              <w:t>非目标（同行/围观）或没到时间的沉淀客户</w:t>
+              <w:t>沉淀客户：真客户但没到时间（土地没定/审批中/内部讨论）</w:t>
             </w:r>
           </w:p>
         </w:tc>
         <w:tc>
           <w:tcPr>
-            <w:tcW w:type="dxa" w:w="3402"/>
+            <w:tcW w:type="dxa" w:w="3118"/>
           </w:tcPr>
           <w:p>
             <w:r/>
@@ -450,7 +872,7 @@
                 <w:rFonts w:ascii="Calibri" w:hAnsi="Calibri" w:eastAsia="微软雅黑"/>
                 <w:sz w:val="19"/>
               </w:rPr>
-              <w:t>同行归档；真客户记录唤醒节点，定期激活</w:t>
+              <w:t>记录唤醒节点，定期激活，突然回来秒回</w:t>
             </w:r>
           </w:p>
         </w:tc>
@@ -458,7 +880,7 @@
       <w:tr>
         <w:tc>
           <w:tcPr>
-            <w:tcW w:type="dxa" w:w="1247"/>
+            <w:tcW w:type="dxa" w:w="1701"/>
           </w:tcPr>
           <w:p>
             <w:r/>
@@ -467,13 +889,13 @@
                 <w:rFonts w:ascii="Calibri" w:hAnsi="Calibri" w:eastAsia="微软雅黑"/>
                 <w:sz w:val="19"/>
               </w:rPr>
-              <w:t>V</w:t>
+              <w:t>V / V2 / V3</w:t>
             </w:r>
           </w:p>
         </w:tc>
         <w:tc>
           <w:tcPr>
-            <w:tcW w:type="dxa" w:w="5272"/>
+            <w:tcW w:type="dxa" w:w="5386"/>
           </w:tcPr>
           <w:p>
             <w:r/>
@@ -482,13 +904,13 @@
                 <w:rFonts w:ascii="Calibri" w:hAnsi="Calibri" w:eastAsia="微软雅黑"/>
                 <w:sz w:val="19"/>
               </w:rPr>
-              <w:t>已成交 1 单</w:t>
+              <w:t>已成交 / 复购 / 高复购代理型</w:t>
             </w:r>
           </w:p>
         </w:tc>
         <w:tc>
           <w:tcPr>
-            <w:tcW w:type="dxa" w:w="3402"/>
+            <w:tcW w:type="dxa" w:w="3118"/>
           </w:tcPr>
           <w:p>
             <w:r/>
@@ -497,101 +919,7 @@
                 <w:rFonts w:ascii="Calibri" w:hAnsi="Calibri" w:eastAsia="微软雅黑"/>
                 <w:sz w:val="19"/>
               </w:rPr>
-              <w:t>跟单交付 + 促复购</w:t>
-            </w:r>
-          </w:p>
-        </w:tc>
-      </w:tr>
-      <w:tr>
-        <w:tc>
-          <w:tcPr>
-            <w:tcW w:type="dxa" w:w="1247"/>
-          </w:tcPr>
-          <w:p>
-            <w:r/>
-            <w:r>
-              <w:rPr>
-                <w:rFonts w:ascii="Calibri" w:hAnsi="Calibri" w:eastAsia="微软雅黑"/>
-                <w:sz w:val="19"/>
-              </w:rPr>
-              <w:t>V2</w:t>
-            </w:r>
-          </w:p>
-        </w:tc>
-        <w:tc>
-          <w:tcPr>
-            <w:tcW w:type="dxa" w:w="5272"/>
-          </w:tcPr>
-          <w:p>
-            <w:r/>
-            <w:r>
-              <w:rPr>
-                <w:rFonts w:ascii="Calibri" w:hAnsi="Calibri" w:eastAsia="微软雅黑"/>
-                <w:sz w:val="19"/>
-              </w:rPr>
-              <w:t>复购客户（2单以上）</w:t>
-            </w:r>
-          </w:p>
-        </w:tc>
-        <w:tc>
-          <w:tcPr>
-            <w:tcW w:type="dxa" w:w="3402"/>
-          </w:tcPr>
-          <w:p>
-            <w:r/>
-            <w:r>
-              <w:rPr>
-                <w:rFonts w:ascii="Calibri" w:hAnsi="Calibri" w:eastAsia="微软雅黑"/>
-                <w:sz w:val="19"/>
-              </w:rPr>
-              <w:t>重点维护，新品政策优先</w:t>
-            </w:r>
-          </w:p>
-        </w:tc>
-      </w:tr>
-      <w:tr>
-        <w:tc>
-          <w:tcPr>
-            <w:tcW w:type="dxa" w:w="1247"/>
-          </w:tcPr>
-          <w:p>
-            <w:r/>
-            <w:r>
-              <w:rPr>
-                <w:rFonts w:ascii="Calibri" w:hAnsi="Calibri" w:eastAsia="微软雅黑"/>
-                <w:sz w:val="19"/>
-              </w:rPr>
-              <w:t>V3</w:t>
-            </w:r>
-          </w:p>
-        </w:tc>
-        <w:tc>
-          <w:tcPr>
-            <w:tcW w:type="dxa" w:w="5272"/>
-          </w:tcPr>
-          <w:p>
-            <w:r/>
-            <w:r>
-              <w:rPr>
-                <w:rFonts w:ascii="Calibri" w:hAnsi="Calibri" w:eastAsia="微软雅黑"/>
-                <w:sz w:val="19"/>
-              </w:rPr>
-              <w:t>高复购 / 代理型长期客户</w:t>
-            </w:r>
-          </w:p>
-        </w:tc>
-        <w:tc>
-          <w:tcPr>
-            <w:tcW w:type="dxa" w:w="3402"/>
-          </w:tcPr>
-          <w:p>
-            <w:r/>
-            <w:r>
-              <w:rPr>
-                <w:rFonts w:ascii="Calibri" w:hAnsi="Calibri" w:eastAsia="微软雅黑"/>
-                <w:sz w:val="19"/>
-              </w:rPr>
-              <w:t>战略客户，老板级维护</w:t>
+              <w:t>跟单促复购 / 重点维护 / 长期战略维护</w:t>
             </w:r>
           </w:p>
         </w:tc>
@@ -611,8 +939,369 @@
           <w:rFonts w:ascii="Calibri" w:hAnsi="Calibri" w:eastAsia="微软雅黑"/>
           <w:b w:val="0"/>
         </w:rPr>
-        <w:t>标签串格式：等级 + 来源 + 类型 + 国家 + 私域状态，例如 AF民宿墨西哥待报价、⭐️AT住沙特待资料。来源代码：T=TikTok、F=Facebook、S=视频号、I=Instagram、Y=YouTube、W=官网、G=Google、R=转介绍、EX=展会。</w:t>
+        <w:t>评级工具：每类客户的原版 A/B/C/D 判断标准表 + 13 条"直接降级清单"（如美加澳要求保证整屋认证一律 D）+ 高/低意向信号清单 + 信息完整度三档。每个评级必须给出至少 3 条依据，引用客户原话或行为。</w:t>
       </w:r>
+    </w:p>
+    <w:p>
+      <w:pPr>
+        <w:spacing w:after="120"/>
+      </w:pPr>
+      <w:r>
+        <w:rPr>
+          <w:rFonts w:ascii="Calibri" w:hAnsi="Calibri" w:eastAsia="微软雅黑"/>
+          <w:b/>
+        </w:rPr>
+        <w:t>第三步：定采购优先级并绑定跟进节奏</w:t>
+      </w:r>
+    </w:p>
+    <w:tbl>
+      <w:tblPr>
+        <w:tblStyle w:val="LightGrid-Accent1"/>
+        <w:tblW w:type="auto" w:w="0"/>
+        <w:tblLook w:firstColumn="1" w:firstRow="1" w:lastColumn="0" w:lastRow="0" w:noHBand="0" w:noVBand="1" w:val="04A0"/>
+      </w:tblPr>
+      <w:tblGrid>
+        <w:gridCol w:w="2880"/>
+        <w:gridCol w:w="2880"/>
+        <w:gridCol w:w="2880"/>
+      </w:tblGrid>
+      <w:tr>
+        <w:tc>
+          <w:tcPr>
+            <w:tcW w:type="dxa" w:w="1984"/>
+          </w:tcPr>
+          <w:p>
+            <w:r/>
+            <w:r>
+              <w:rPr>
+                <w:rFonts w:ascii="Calibri" w:hAnsi="Calibri" w:eastAsia="微软雅黑"/>
+                <w:b/>
+                <w:sz w:val="20"/>
+              </w:rPr>
+              <w:t>优先级</w:t>
+            </w:r>
+          </w:p>
+        </w:tc>
+        <w:tc>
+          <w:tcPr>
+            <w:tcW w:type="dxa" w:w="1701"/>
+          </w:tcPr>
+          <w:p>
+            <w:r/>
+            <w:r>
+              <w:rPr>
+                <w:rFonts w:ascii="Calibri" w:hAnsi="Calibri" w:eastAsia="微软雅黑"/>
+                <w:b/>
+                <w:sz w:val="20"/>
+              </w:rPr>
+              <w:t>对应</w:t>
+            </w:r>
+          </w:p>
+        </w:tc>
+        <w:tc>
+          <w:tcPr>
+            <w:tcW w:type="dxa" w:w="6520"/>
+          </w:tcPr>
+          <w:p>
+            <w:r/>
+            <w:r>
+              <w:rPr>
+                <w:rFonts w:ascii="Calibri" w:hAnsi="Calibri" w:eastAsia="微软雅黑"/>
+                <w:b/>
+                <w:sz w:val="20"/>
+              </w:rPr>
+              <w:t>跟进节奏（公司原表）</w:t>
+            </w:r>
+          </w:p>
+        </w:tc>
+      </w:tr>
+      <w:tr>
+        <w:tc>
+          <w:tcPr>
+            <w:tcW w:type="dxa" w:w="1984"/>
+          </w:tcPr>
+          <w:p>
+            <w:r/>
+            <w:r>
+              <w:rPr>
+                <w:rFonts w:ascii="Calibri" w:hAnsi="Calibri" w:eastAsia="微软雅黑"/>
+                <w:sz w:val="19"/>
+              </w:rPr>
+              <w:t>P0 立刻分配</w:t>
+            </w:r>
+          </w:p>
+        </w:tc>
+        <w:tc>
+          <w:tcPr>
+            <w:tcW w:type="dxa" w:w="1701"/>
+          </w:tcPr>
+          <w:p>
+            <w:r/>
+            <w:r>
+              <w:rPr>
+                <w:rFonts w:ascii="Calibri" w:hAnsi="Calibri" w:eastAsia="微软雅黑"/>
+                <w:sz w:val="19"/>
+              </w:rPr>
+              <w:t>A / A柜</w:t>
+            </w:r>
+          </w:p>
+        </w:tc>
+        <w:tc>
+          <w:tcPr>
+            <w:tcW w:type="dxa" w:w="6520"/>
+          </w:tcPr>
+          <w:p>
+            <w:r/>
+            <w:r>
+              <w:rPr>
+                <w:rFonts w:ascii="Calibri" w:hAnsi="Calibri" w:eastAsia="微软雅黑"/>
+                <w:sz w:val="19"/>
+              </w:rPr>
+              <w:t>15分钟首响→当天推进→2-4小时轻提醒→第2天换角度→第3天发案例→第5天推视频/报价→第7天最后重点→之后降B每周跟</w:t>
+            </w:r>
+          </w:p>
+        </w:tc>
+      </w:tr>
+      <w:tr>
+        <w:tc>
+          <w:tcPr>
+            <w:tcW w:type="dxa" w:w="1984"/>
+          </w:tcPr>
+          <w:p>
+            <w:r/>
+            <w:r>
+              <w:rPr>
+                <w:rFonts w:ascii="Calibri" w:hAnsi="Calibri" w:eastAsia="微软雅黑"/>
+                <w:sz w:val="19"/>
+              </w:rPr>
+              <w:t>P1 分配培养</w:t>
+            </w:r>
+          </w:p>
+        </w:tc>
+        <w:tc>
+          <w:tcPr>
+            <w:tcW w:type="dxa" w:w="1701"/>
+          </w:tcPr>
+          <w:p>
+            <w:r/>
+            <w:r>
+              <w:rPr>
+                <w:rFonts w:ascii="Calibri" w:hAnsi="Calibri" w:eastAsia="微软雅黑"/>
+                <w:sz w:val="19"/>
+              </w:rPr>
+              <w:t>B</w:t>
+            </w:r>
+          </w:p>
+        </w:tc>
+        <w:tc>
+          <w:tcPr>
+            <w:tcW w:type="dxa" w:w="6520"/>
+          </w:tcPr>
+          <w:p>
+            <w:r/>
+            <w:r>
+              <w:rPr>
+                <w:rFonts w:ascii="Calibri" w:hAnsi="Calibri" w:eastAsia="微软雅黑"/>
+                <w:sz w:val="19"/>
+              </w:rPr>
+              <w:t>当天回复→1天跟一次→3天发案例→7天再跟→14天发项目案例→30天入长期池</w:t>
+            </w:r>
+          </w:p>
+        </w:tc>
+      </w:tr>
+      <w:tr>
+        <w:tc>
+          <w:tcPr>
+            <w:tcW w:type="dxa" w:w="1984"/>
+          </w:tcPr>
+          <w:p>
+            <w:r/>
+            <w:r>
+              <w:rPr>
+                <w:rFonts w:ascii="Calibri" w:hAnsi="Calibri" w:eastAsia="微软雅黑"/>
+                <w:sz w:val="19"/>
+              </w:rPr>
+              <w:t>P2 助理跟进</w:t>
+            </w:r>
+          </w:p>
+        </w:tc>
+        <w:tc>
+          <w:tcPr>
+            <w:tcW w:type="dxa" w:w="1701"/>
+          </w:tcPr>
+          <w:p>
+            <w:r/>
+            <w:r>
+              <w:rPr>
+                <w:rFonts w:ascii="Calibri" w:hAnsi="Calibri" w:eastAsia="微软雅黑"/>
+                <w:sz w:val="19"/>
+              </w:rPr>
+              <w:t>C</w:t>
+            </w:r>
+          </w:p>
+        </w:tc>
+        <w:tc>
+          <w:tcPr>
+            <w:tcW w:type="dxa" w:w="6520"/>
+          </w:tcPr>
+          <w:p>
+            <w:r/>
+            <w:r>
+              <w:rPr>
+                <w:rFonts w:ascii="Calibri" w:hAnsi="Calibri" w:eastAsia="微软雅黑"/>
+                <w:sz w:val="19"/>
+              </w:rPr>
+              <w:t>标准回复+提问→1/3/7天递进→归档低频维护</w:t>
+            </w:r>
+          </w:p>
+        </w:tc>
+      </w:tr>
+      <w:tr>
+        <w:tc>
+          <w:tcPr>
+            <w:tcW w:type="dxa" w:w="1984"/>
+          </w:tcPr>
+          <w:p>
+            <w:r/>
+            <w:r>
+              <w:rPr>
+                <w:rFonts w:ascii="Calibri" w:hAnsi="Calibri" w:eastAsia="微软雅黑"/>
+                <w:sz w:val="19"/>
+              </w:rPr>
+              <w:t>P3 归档</w:t>
+            </w:r>
+          </w:p>
+        </w:tc>
+        <w:tc>
+          <w:tcPr>
+            <w:tcW w:type="dxa" w:w="1701"/>
+          </w:tcPr>
+          <w:p>
+            <w:r/>
+            <w:r>
+              <w:rPr>
+                <w:rFonts w:ascii="Calibri" w:hAnsi="Calibri" w:eastAsia="微软雅黑"/>
+                <w:sz w:val="19"/>
+              </w:rPr>
+              <w:t>D</w:t>
+            </w:r>
+          </w:p>
+        </w:tc>
+        <w:tc>
+          <w:tcPr>
+            <w:tcW w:type="dxa" w:w="6520"/>
+          </w:tcPr>
+          <w:p>
+            <w:r/>
+            <w:r>
+              <w:rPr>
+                <w:rFonts w:ascii="Calibri" w:hAnsi="Calibri" w:eastAsia="微软雅黑"/>
+                <w:sz w:val="19"/>
+              </w:rPr>
+              <w:t>标准动作走完即归档，不投入</w:t>
+            </w:r>
+          </w:p>
+        </w:tc>
+      </w:tr>
+      <w:tr>
+        <w:tc>
+          <w:tcPr>
+            <w:tcW w:type="dxa" w:w="1984"/>
+          </w:tcPr>
+          <w:p>
+            <w:r/>
+            <w:r>
+              <w:rPr>
+                <w:rFonts w:ascii="Calibri" w:hAnsi="Calibri" w:eastAsia="微软雅黑"/>
+                <w:sz w:val="19"/>
+              </w:rPr>
+              <w:t>P-节点</w:t>
+            </w:r>
+          </w:p>
+        </w:tc>
+        <w:tc>
+          <w:tcPr>
+            <w:tcW w:type="dxa" w:w="1701"/>
+          </w:tcPr>
+          <w:p>
+            <w:r/>
+            <w:r>
+              <w:rPr>
+                <w:rFonts w:ascii="Calibri" w:hAnsi="Calibri" w:eastAsia="微软雅黑"/>
+                <w:sz w:val="19"/>
+              </w:rPr>
+              <w:t>S</w:t>
+            </w:r>
+          </w:p>
+        </w:tc>
+        <w:tc>
+          <w:tcPr>
+            <w:tcW w:type="dxa" w:w="6520"/>
+          </w:tcPr>
+          <w:p>
+            <w:r/>
+            <w:r>
+              <w:rPr>
+                <w:rFonts w:ascii="Calibri" w:hAnsi="Calibri" w:eastAsia="微软雅黑"/>
+                <w:sz w:val="19"/>
+              </w:rPr>
+              <w:t>记录预计启动时间，节点前1-2个月激活</w:t>
+            </w:r>
+          </w:p>
+        </w:tc>
+      </w:tr>
+      <w:tr>
+        <w:tc>
+          <w:tcPr>
+            <w:tcW w:type="dxa" w:w="1984"/>
+          </w:tcPr>
+          <w:p>
+            <w:r/>
+            <w:r>
+              <w:rPr>
+                <w:rFonts w:ascii="Calibri" w:hAnsi="Calibri" w:eastAsia="微软雅黑"/>
+                <w:sz w:val="19"/>
+              </w:rPr>
+              <w:t>P-复购</w:t>
+            </w:r>
+          </w:p>
+        </w:tc>
+        <w:tc>
+          <w:tcPr>
+            <w:tcW w:type="dxa" w:w="1701"/>
+          </w:tcPr>
+          <w:p>
+            <w:r/>
+            <w:r>
+              <w:rPr>
+                <w:rFonts w:ascii="Calibri" w:hAnsi="Calibri" w:eastAsia="微软雅黑"/>
+                <w:sz w:val="19"/>
+              </w:rPr>
+              <w:t>V系</w:t>
+            </w:r>
+          </w:p>
+        </w:tc>
+        <w:tc>
+          <w:tcPr>
+            <w:tcW w:type="dxa" w:w="6520"/>
+          </w:tcPr>
+          <w:p>
+            <w:r/>
+            <w:r>
+              <w:rPr>
+                <w:rFonts w:ascii="Calibri" w:hAnsi="Calibri" w:eastAsia="微软雅黑"/>
+                <w:sz w:val="19"/>
+              </w:rPr>
+              <w:t>按复购优先级维护（民宿交付满3个月=二期窗口）</w:t>
+            </w:r>
+          </w:p>
+        </w:tc>
+      </w:tr>
+    </w:tbl>
+    <w:p>
+      <w:pPr>
+        <w:spacing w:after="40"/>
+      </w:pPr>
     </w:p>
     <w:p>
       <w:pPr>
@@ -624,14 +1313,21 @@
     </w:p>
     <w:p>
       <w:pPr>
-        <w:spacing w:after="120"/>
+        <w:pStyle w:val="ListBullet"/>
+        <w:spacing w:after="60"/>
       </w:pPr>
       <w:r>
         <w:rPr>
           <w:rFonts w:ascii="Calibri" w:hAnsi="Calibri" w:eastAsia="微软雅黑"/>
           <w:b/>
         </w:rPr>
-        <w:t>单个客户：</w:t>
+        <w:t>单个客户</w:t>
+      </w:r>
+      <w:r>
+        <w:rPr>
+          <w:rFonts w:ascii="Calibri" w:hAnsi="Calibri" w:eastAsia="微软雅黑"/>
+        </w:rPr>
+        <w:t>（发一段聊天记录说"评级"）：返回评级卡——类型+依据、等级+3条依据、优先级+命中的分配时机、标签串、信息缺口、下一步动作、跟进节奏、风险提示</w:t>
       </w:r>
     </w:p>
     <w:p>
@@ -642,8 +1338,15 @@
       <w:r>
         <w:rPr>
           <w:rFonts w:ascii="Calibri" w:hAnsi="Calibri" w:eastAsia="微软雅黑"/>
+          <w:b/>
         </w:rPr>
-        <w:t>把该客户的聊天记录（或客户资料摘要）发给 AI，说"评级"</w:t>
+        <w:t>批量盘点</w:t>
+      </w:r>
+      <w:r>
+        <w:rPr>
+          <w:rFonts w:ascii="Calibri" w:hAnsi="Calibri" w:eastAsia="微软雅黑"/>
+        </w:rPr>
+        <w:t>（一批记录说"批量评级"）：返回按优先级排序总表 + 「今天必须行动」清单 + 「停止投入」清单</w:t>
       </w:r>
     </w:p>
     <w:p>
@@ -654,20 +1357,15 @@
       <w:r>
         <w:rPr>
           <w:rFonts w:ascii="Calibri" w:hAnsi="Calibri" w:eastAsia="微软雅黑"/>
+          <w:b/>
         </w:rPr>
-        <w:t>AI 返回一张评级卡：等级、类型、标签串、三条依据、信息缺口、建议动作、跟进节奏、风险提示</w:t>
+        <w:t>老客户盘点</w:t>
       </w:r>
-    </w:p>
-    <w:p>
-      <w:pPr>
-        <w:spacing w:after="120"/>
-      </w:pPr>
       <w:r>
         <w:rPr>
           <w:rFonts w:ascii="Calibri" w:hAnsi="Calibri" w:eastAsia="微软雅黑"/>
-          <w:b/>
         </w:rPr>
-        <w:t>批量盘点：</w:t>
+        <w:t>（附最后联系时间和成交史）：已成交评复购优先级；沉睡客户按"当时卡点→卡点时效性→信息完整度→沉睡时长"重评激活优先级，激活话术直接引用公司激活话术库的对应场景（13个场景各3轮话术）</w:t>
       </w:r>
     </w:p>
     <w:p>
@@ -678,68 +1376,15 @@
       <w:r>
         <w:rPr>
           <w:rFonts w:ascii="Calibri" w:hAnsi="Calibri" w:eastAsia="微软雅黑"/>
+          <w:b/>
         </w:rPr>
-        <w:t>把一批客户的记录/摘要一起发给 AI，说"批量评级"</w:t>
+        <w:t>CRM 标签生成</w:t>
       </w:r>
-    </w:p>
-    <w:p>
-      <w:pPr>
-        <w:pStyle w:val="ListBullet"/>
-        <w:spacing w:after="60"/>
-      </w:pPr>
       <w:r>
         <w:rPr>
           <w:rFonts w:ascii="Calibri" w:hAnsi="Calibri" w:eastAsia="微软雅黑"/>
         </w:rPr>
-        <w:t>AI 返回按等级排序的总表，最后附两张清单：「今天必须行动」（A级和突然回来的客户）和「停止投入」（D级和疑似同行）</w:t>
-      </w:r>
-    </w:p>
-    <w:p>
-      <w:pPr>
-        <w:spacing w:after="120"/>
-      </w:pPr>
-      <w:r>
-        <w:rPr>
-          <w:rFonts w:ascii="Calibri" w:hAnsi="Calibri" w:eastAsia="微软雅黑"/>
-          <w:b/>
-        </w:rPr>
-        <w:t>老客户盘点（重点功能）：</w:t>
-      </w:r>
-    </w:p>
-    <w:p>
-      <w:pPr>
-        <w:pStyle w:val="ListBullet"/>
-        <w:spacing w:after="60"/>
-      </w:pPr>
-      <w:r>
-        <w:rPr>
-          <w:rFonts w:ascii="Calibri" w:hAnsi="Calibri" w:eastAsia="微软雅黑"/>
-        </w:rPr>
-        <w:t>输入时附上：最后联系时间、有没有成交过、当时聊到哪一步</w:t>
-      </w:r>
-    </w:p>
-    <w:p>
-      <w:pPr>
-        <w:pStyle w:val="ListBullet"/>
-        <w:spacing w:after="60"/>
-      </w:pPr>
-      <w:r>
-        <w:rPr>
-          <w:rFonts w:ascii="Calibri" w:hAnsi="Calibri" w:eastAsia="微软雅黑"/>
-        </w:rPr>
-        <w:t>已成交客户 → 评复购优先级（民宿营地类交付满3个月是二期窗口；代理商按补货周期）</w:t>
-      </w:r>
-    </w:p>
-    <w:p>
-      <w:pPr>
-        <w:pStyle w:val="ListBullet"/>
-        <w:spacing w:after="60"/>
-      </w:pPr>
-      <w:r>
-        <w:rPr>
-          <w:rFonts w:ascii="Calibri" w:hAnsi="Calibri" w:eastAsia="微软雅黑"/>
-        </w:rPr>
-        <w:t>未成交沉睡客户 → 评激活优先级（高/中/低/归档）+ 具体激活方式建议</w:t>
+        <w:t>：输出符合公司规范的标签串（成交距离+来源+类型+国家+私域状态，如 ⭐️AF民宿菲律宾待报价），可直接写回工作台</w:t>
       </w:r>
     </w:p>
     <w:p>
@@ -752,7 +1397,7 @@
           <w:b w:val="0"/>
           <w:color w:val="595959"/>
         </w:rPr>
-        <w:t>信息不够时，AI 会输出"等级=待定"并列出必须先补的 2-3 个问题，不会硬评。</w:t>
+        <w:t>信息不够时 AI 输出"等级=待定"并按"必问十连"顺序列出必须先补的 2-3 个问题，不硬评。</w:t>
       </w:r>
     </w:p>
     <w:p>
@@ -760,19 +1405,7 @@
         <w:pStyle w:val="Heading1"/>
       </w:pPr>
       <w:r>
-        <w:t>四、老客户是怎么筛的（核心逻辑）</w:t>
-      </w:r>
-    </w:p>
-    <w:p>
-      <w:pPr>
-        <w:spacing w:after="120"/>
-      </w:pPr>
-      <w:r>
-        <w:rPr>
-          <w:rFonts w:ascii="Calibri" w:hAnsi="Calibri" w:eastAsia="微软雅黑"/>
-          <w:b w:val="0"/>
-        </w:rPr>
-        <w:t>对每个沉睡客户走四步：</w:t>
+        <w:t>四、这个 Skill 是怎么做出来的</w:t>
       </w:r>
     </w:p>
     <w:p>
@@ -785,13 +1418,13 @@
           <w:rFonts w:ascii="Calibri" w:hAnsi="Calibri" w:eastAsia="微软雅黑"/>
           <w:b/>
         </w:rPr>
-        <w:t>第一步：还原当时的卡点</w:t>
+        <w:t>权威依据是两份公司文档</w:t>
       </w:r>
       <w:r>
         <w:rPr>
           <w:rFonts w:ascii="Calibri" w:hAnsi="Calibri" w:eastAsia="微软雅黑"/>
         </w:rPr>
-        <w:t>，从历史记录找出当时卡在哪：价格、运费、土地、审批、资金、家人决策、比价、还是无原因失联</w:t>
+        <w:t>：《客户画像及客户筛选话术库》（六类客户分级原表、升降级条件、45场景筛选决策表、13场景激活话术库、跟进节奏表、标签体系）+《客户判断与信息收集SOP》（判断总逻辑、五步流程、分类型信号与卡点、等级标准、口诀）。两份文档 100% 通读，关键表格原文入库。</w:t>
       </w:r>
     </w:p>
     <w:p>
@@ -804,13 +1437,13 @@
           <w:rFonts w:ascii="Calibri" w:hAnsi="Calibri" w:eastAsia="微软雅黑"/>
           <w:b/>
         </w:rPr>
-        <w:t>第二步：判断卡点会不会过期</w:t>
+        <w:t>做的事情是"重组"不是"改写"</w:t>
       </w:r>
       <w:r>
         <w:rPr>
           <w:rFonts w:ascii="Calibri" w:hAnsi="Calibri" w:eastAsia="微软雅黑"/>
         </w:rPr>
-        <w:t>。时间型卡点（审批中/等资金/项目没到季节）会自然解决=高价值；方案型卡点（运费贵/超预算/怕安装）我们能解决=中价值；结构型卡点（预算完全不够/没土地没计划/纯比价）=低价值</w:t>
+        <w:t>：公司文档是给人看的培训材料，AI 需要的是可执行的判定规则。做法：把散落的规则重组成"类型→等级→优先级"三步流水线；话术表里每行的"等级建议/是否分配/下一步/红线"抽出来变成决策表；激活话术库变成老客户激活的标准动作库。</w:t>
       </w:r>
     </w:p>
     <w:p>
@@ -823,13 +1456,13 @@
           <w:rFonts w:ascii="Calibri" w:hAnsi="Calibri" w:eastAsia="微软雅黑"/>
           <w:b/>
         </w:rPr>
-        <w:t>第三步：看当时给过多少真信息</w:t>
+        <w:t>唯一的补充推导已标注来源</w:t>
       </w:r>
       <w:r>
         <w:rPr>
           <w:rFonts w:ascii="Calibri" w:hAnsi="Calibri" w:eastAsia="微软雅黑"/>
         </w:rPr>
-        <w:t>。当时给过土地照片、详细地址、数量的客户，睡半年也值得重点激活；只问过价的降低频池</w:t>
+        <w:t>：公司规则没有细化"老客户怎么重评"，我们用公司已有的 S类定义+卡点判断表+信息完整度标准，组合推导出"卡点时效性×信息完整度×沉睡时长"激活优先级矩阵，并在文件里明确标注这是补充推导，可随时按实战修订。</w:t>
       </w:r>
     </w:p>
     <w:p>
@@ -842,295 +1475,13 @@
           <w:rFonts w:ascii="Calibri" w:hAnsi="Calibri" w:eastAsia="微软雅黑"/>
           <w:b/>
         </w:rPr>
-        <w:t>第四步：按沉睡时长分层</w:t>
+        <w:t>上线前做了回归测试</w:t>
       </w:r>
       <w:r>
         <w:rPr>
           <w:rFonts w:ascii="Calibri" w:hAnsi="Calibri" w:eastAsia="微软雅黑"/>
         </w:rPr>
-        <w:t>：1-3个月=重点激活池；3-6个月=定期案例激活；6个月以上=年度节点激活（新品/促销/旺季前）</w:t>
-      </w:r>
-    </w:p>
-    <w:tbl>
-      <w:tblPr>
-        <w:tblStyle w:val="LightGrid-Accent1"/>
-        <w:tblW w:type="auto" w:w="0"/>
-        <w:tblLook w:firstColumn="1" w:firstRow="1" w:lastColumn="0" w:lastRow="0" w:noHBand="0" w:noVBand="1" w:val="04A0"/>
-      </w:tblPr>
-      <w:tblGrid>
-        <w:gridCol w:w="2160"/>
-        <w:gridCol w:w="2160"/>
-        <w:gridCol w:w="2160"/>
-        <w:gridCol w:w="2160"/>
-      </w:tblGrid>
-      <w:tr>
-        <w:tc>
-          <w:tcPr>
-            <w:tcW w:type="dxa" w:w="3118"/>
-          </w:tcPr>
-          <w:p>
-            <w:r/>
-            <w:r>
-              <w:rPr>
-                <w:rFonts w:ascii="Calibri" w:hAnsi="Calibri" w:eastAsia="微软雅黑"/>
-                <w:b/>
-                <w:sz w:val="20"/>
-              </w:rPr>
-              <w:t>卡点类型 \ 信息完整度</w:t>
-            </w:r>
-          </w:p>
-        </w:tc>
-        <w:tc>
-          <w:tcPr>
-            <w:tcW w:type="dxa" w:w="2835"/>
-          </w:tcPr>
-          <w:p>
-            <w:r/>
-            <w:r>
-              <w:rPr>
-                <w:rFonts w:ascii="Calibri" w:hAnsi="Calibri" w:eastAsia="微软雅黑"/>
-                <w:b/>
-                <w:sz w:val="20"/>
-              </w:rPr>
-              <w:t>高（有土地/地址/数量）</w:t>
-            </w:r>
-          </w:p>
-        </w:tc>
-        <w:tc>
-          <w:tcPr>
-            <w:tcW w:type="dxa" w:w="1984"/>
-          </w:tcPr>
-          <w:p>
-            <w:r/>
-            <w:r>
-              <w:rPr>
-                <w:rFonts w:ascii="Calibri" w:hAnsi="Calibri" w:eastAsia="微软雅黑"/>
-                <w:b/>
-                <w:sz w:val="20"/>
-              </w:rPr>
-              <w:t>中</w:t>
-            </w:r>
-          </w:p>
-        </w:tc>
-        <w:tc>
-          <w:tcPr>
-            <w:tcW w:type="dxa" w:w="1984"/>
-          </w:tcPr>
-          <w:p>
-            <w:r/>
-            <w:r>
-              <w:rPr>
-                <w:rFonts w:ascii="Calibri" w:hAnsi="Calibri" w:eastAsia="微软雅黑"/>
-                <w:b/>
-                <w:sz w:val="20"/>
-              </w:rPr>
-              <w:t>低（只问过价）</w:t>
-            </w:r>
-          </w:p>
-        </w:tc>
-      </w:tr>
-      <w:tr>
-        <w:tc>
-          <w:tcPr>
-            <w:tcW w:type="dxa" w:w="3118"/>
-          </w:tcPr>
-          <w:p>
-            <w:r/>
-            <w:r>
-              <w:rPr>
-                <w:rFonts w:ascii="Calibri" w:hAnsi="Calibri" w:eastAsia="微软雅黑"/>
-                <w:sz w:val="19"/>
-              </w:rPr>
-              <w:t>时间型（会自然解决）</w:t>
-            </w:r>
-          </w:p>
-        </w:tc>
-        <w:tc>
-          <w:tcPr>
-            <w:tcW w:type="dxa" w:w="2835"/>
-          </w:tcPr>
-          <w:p>
-            <w:r/>
-            <w:r>
-              <w:rPr>
-                <w:rFonts w:ascii="Calibri" w:hAnsi="Calibri" w:eastAsia="微软雅黑"/>
-                <w:sz w:val="19"/>
-              </w:rPr>
-              <w:t>激活优先级：高</w:t>
-            </w:r>
-          </w:p>
-        </w:tc>
-        <w:tc>
-          <w:tcPr>
-            <w:tcW w:type="dxa" w:w="1984"/>
-          </w:tcPr>
-          <w:p>
-            <w:r/>
-            <w:r>
-              <w:rPr>
-                <w:rFonts w:ascii="Calibri" w:hAnsi="Calibri" w:eastAsia="微软雅黑"/>
-                <w:sz w:val="19"/>
-              </w:rPr>
-              <w:t>高</w:t>
-            </w:r>
-          </w:p>
-        </w:tc>
-        <w:tc>
-          <w:tcPr>
-            <w:tcW w:type="dxa" w:w="1984"/>
-          </w:tcPr>
-          <w:p>
-            <w:r/>
-            <w:r>
-              <w:rPr>
-                <w:rFonts w:ascii="Calibri" w:hAnsi="Calibri" w:eastAsia="微软雅黑"/>
-                <w:sz w:val="19"/>
-              </w:rPr>
-              <w:t>中</w:t>
-            </w:r>
-          </w:p>
-        </w:tc>
-      </w:tr>
-      <w:tr>
-        <w:tc>
-          <w:tcPr>
-            <w:tcW w:type="dxa" w:w="3118"/>
-          </w:tcPr>
-          <w:p>
-            <w:r/>
-            <w:r>
-              <w:rPr>
-                <w:rFonts w:ascii="Calibri" w:hAnsi="Calibri" w:eastAsia="微软雅黑"/>
-                <w:sz w:val="19"/>
-              </w:rPr>
-              <w:t>方案型（我们能解决）</w:t>
-            </w:r>
-          </w:p>
-        </w:tc>
-        <w:tc>
-          <w:tcPr>
-            <w:tcW w:type="dxa" w:w="2835"/>
-          </w:tcPr>
-          <w:p>
-            <w:r/>
-            <w:r>
-              <w:rPr>
-                <w:rFonts w:ascii="Calibri" w:hAnsi="Calibri" w:eastAsia="微软雅黑"/>
-                <w:sz w:val="19"/>
-              </w:rPr>
-              <w:t>高</w:t>
-            </w:r>
-          </w:p>
-        </w:tc>
-        <w:tc>
-          <w:tcPr>
-            <w:tcW w:type="dxa" w:w="1984"/>
-          </w:tcPr>
-          <w:p>
-            <w:r/>
-            <w:r>
-              <w:rPr>
-                <w:rFonts w:ascii="Calibri" w:hAnsi="Calibri" w:eastAsia="微软雅黑"/>
-                <w:sz w:val="19"/>
-              </w:rPr>
-              <w:t>中</w:t>
-            </w:r>
-          </w:p>
-        </w:tc>
-        <w:tc>
-          <w:tcPr>
-            <w:tcW w:type="dxa" w:w="1984"/>
-          </w:tcPr>
-          <w:p>
-            <w:r/>
-            <w:r>
-              <w:rPr>
-                <w:rFonts w:ascii="Calibri" w:hAnsi="Calibri" w:eastAsia="微软雅黑"/>
-                <w:sz w:val="19"/>
-              </w:rPr>
-              <w:t>低</w:t>
-            </w:r>
-          </w:p>
-        </w:tc>
-      </w:tr>
-      <w:tr>
-        <w:tc>
-          <w:tcPr>
-            <w:tcW w:type="dxa" w:w="3118"/>
-          </w:tcPr>
-          <w:p>
-            <w:r/>
-            <w:r>
-              <w:rPr>
-                <w:rFonts w:ascii="Calibri" w:hAnsi="Calibri" w:eastAsia="微软雅黑"/>
-                <w:sz w:val="19"/>
-              </w:rPr>
-              <w:t>结构型（解决不了）</w:t>
-            </w:r>
-          </w:p>
-        </w:tc>
-        <w:tc>
-          <w:tcPr>
-            <w:tcW w:type="dxa" w:w="2835"/>
-          </w:tcPr>
-          <w:p>
-            <w:r/>
-            <w:r>
-              <w:rPr>
-                <w:rFonts w:ascii="Calibri" w:hAnsi="Calibri" w:eastAsia="微软雅黑"/>
-                <w:sz w:val="19"/>
-              </w:rPr>
-              <w:t>中（等条件变化）</w:t>
-            </w:r>
-          </w:p>
-        </w:tc>
-        <w:tc>
-          <w:tcPr>
-            <w:tcW w:type="dxa" w:w="1984"/>
-          </w:tcPr>
-          <w:p>
-            <w:r/>
-            <w:r>
-              <w:rPr>
-                <w:rFonts w:ascii="Calibri" w:hAnsi="Calibri" w:eastAsia="微软雅黑"/>
-                <w:sz w:val="19"/>
-              </w:rPr>
-              <w:t>低</w:t>
-            </w:r>
-          </w:p>
-        </w:tc>
-        <w:tc>
-          <w:tcPr>
-            <w:tcW w:type="dxa" w:w="1984"/>
-          </w:tcPr>
-          <w:p>
-            <w:r/>
-            <w:r>
-              <w:rPr>
-                <w:rFonts w:ascii="Calibri" w:hAnsi="Calibri" w:eastAsia="微软雅黑"/>
-                <w:sz w:val="19"/>
-              </w:rPr>
-              <w:t>归档</w:t>
-            </w:r>
-          </w:p>
-        </w:tc>
-      </w:tr>
-    </w:tbl>
-    <w:p>
-      <w:pPr>
-        <w:spacing w:after="40"/>
-      </w:pPr>
-    </w:p>
-    <w:p>
-      <w:pPr>
-        <w:spacing w:after="120"/>
-      </w:pPr>
-      <w:r>
-        <w:rPr>
-          <w:rFonts w:ascii="Calibri" w:hAnsi="Calibri" w:eastAsia="微软雅黑"/>
-          <w:b/>
-        </w:rPr>
-        <w:t>激活铁律：每次激活必须给客户一个"回复的理由"（新案例、运费更新、问项目进度、节点提醒），禁止裸发 Hi 或 Any update。两轮无回应降一档，最多月度一次高质量触达。</w:t>
+        <w:t>：用真实客户对话做测试（新线索、老客户沉睡、套资料型），核对每个输出是否能在公司规则原表中找到依据，全部通过后交付。</w:t>
       </w:r>
     </w:p>
     <w:p>
@@ -1150,7 +1501,7 @@
         <w:rPr>
           <w:rFonts w:ascii="Calibri" w:hAnsi="Calibri" w:eastAsia="微软雅黑"/>
         </w:rPr>
-        <w:t>评级看动作不看表态：愿意给国家、地址、数量、土地的才算意向，嘴上说"很感兴趣"不算</w:t>
+        <w:t>顺序不可乱：类型没判出来就评级=失职，AI 会输出"类型=待定"+必问问题</w:t>
       </w:r>
     </w:p>
     <w:p>
@@ -1162,7 +1513,7 @@
         <w:rPr>
           <w:rFonts w:ascii="Calibri" w:hAnsi="Calibri" w:eastAsia="微软雅黑"/>
         </w:rPr>
-        <w:t>每个评级都带依据，销售可以质疑；发现评错，把这个案例反馈给管理员补进规则</w:t>
+        <w:t>看动作不看表态；"自称大老板/未来想做大项目"不天然升级</w:t>
       </w:r>
     </w:p>
     <w:p>
@@ -1174,7 +1525,7 @@
         <w:rPr>
           <w:rFonts w:ascii="Calibri" w:hAnsi="Calibri" w:eastAsia="微软雅黑"/>
         </w:rPr>
-        <w:t>客户突然给出关键信息（土地照片/地址/数量）时要立即重评升级，并按"秒回"处理</w:t>
+        <w:t>客户突然给出土地图/地址/数量→立即重评升级，按秒回处理</w:t>
       </w:r>
     </w:p>
     <w:p>
@@ -1186,7 +1537,7 @@
         <w:rPr>
           <w:rFonts w:ascii="Calibri" w:hAnsi="Calibri" w:eastAsia="微软雅黑"/>
         </w:rPr>
-        <w:t>美加澳要求整屋认证保证、要账期、要免费样品、只要独家不下样板——这些一律压级，AI 不会心软，人也不要心软</w:t>
+        <w:t>S 级是沉淀不是垃圾，会标记唤醒节点，别手动删除</w:t>
       </w:r>
     </w:p>
     <w:p>
@@ -1198,7 +1549,7 @@
         <w:rPr>
           <w:rFonts w:ascii="Calibri" w:hAnsi="Calibri" w:eastAsia="微软雅黑"/>
         </w:rPr>
-        <w:t>S 级是沉淀不是垃圾：没到时间的真客户会被标记唤醒节点，别手动删掉</w:t>
+        <w:t>发现评错的案例，反馈给管理员补进规则文件，评级会越用越准</w:t>
       </w:r>
     </w:p>
     <w:p>
@@ -1206,7 +1557,7 @@
         <w:pStyle w:val="Heading1"/>
       </w:pPr>
       <w:r>
-        <w:t>六、建议的盘点节奏</w:t>
+        <w:t>六、建议盘点节奏</w:t>
       </w:r>
     </w:p>
     <w:p>
@@ -1218,7 +1569,7 @@
         <w:rPr>
           <w:rFonts w:ascii="Calibri" w:hAnsi="Calibri" w:eastAsia="微软雅黑"/>
         </w:rPr>
-        <w:t>每周：新增线索全部过一遍评级，生成本周 A/B 级清单</w:t>
+        <w:t>每周：新增线索全量评级，产出本周 P0/P1 清单</w:t>
       </w:r>
     </w:p>
     <w:p>
@@ -1230,7 +1581,7 @@
         <w:rPr>
           <w:rFonts w:ascii="Calibri" w:hAnsi="Calibri" w:eastAsia="微软雅黑"/>
         </w:rPr>
-        <w:t>每月：跑一遍 1-3 个月沉睡池，产出本月激活名单（带激活方式）</w:t>
+        <w:t>每月：跑 1-3 个月沉睡池，产出激活名单（带激活话术场景和轮次）</w:t>
       </w:r>
     </w:p>
     <w:p>
@@ -1242,8 +1593,177 @@
         <w:rPr>
           <w:rFonts w:ascii="Calibri" w:hAnsi="Calibri" w:eastAsia="微软雅黑"/>
         </w:rPr>
-        <w:t>每季度：全量老客户重评一次，含已成交客户复购窗口</w:t>
+        <w:t>每季度：全量老客户重评，含已成交客户复购窗口</w:t>
       </w:r>
+    </w:p>
+    <w:p>
+      <w:pPr>
+        <w:pStyle w:val="Heading1"/>
+      </w:pPr>
+      <w:r>
+        <w:t>七、版本记录</w:t>
+      </w:r>
+    </w:p>
+    <w:tbl>
+      <w:tblPr>
+        <w:tblStyle w:val="LightGrid-Accent1"/>
+        <w:tblW w:type="auto" w:w="0"/>
+        <w:tblLook w:firstColumn="1" w:firstRow="1" w:lastColumn="0" w:lastRow="0" w:noHBand="0" w:noVBand="1" w:val="04A0"/>
+      </w:tblPr>
+      <w:tblGrid>
+        <w:gridCol w:w="2880"/>
+        <w:gridCol w:w="2880"/>
+        <w:gridCol w:w="2880"/>
+      </w:tblGrid>
+      <w:tr>
+        <w:tc>
+          <w:tcPr>
+            <w:tcW w:type="dxa" w:w="1417"/>
+          </w:tcPr>
+          <w:p>
+            <w:r/>
+            <w:r>
+              <w:rPr>
+                <w:rFonts w:ascii="Calibri" w:hAnsi="Calibri" w:eastAsia="微软雅黑"/>
+                <w:b/>
+                <w:sz w:val="20"/>
+              </w:rPr>
+              <w:t>版本</w:t>
+            </w:r>
+          </w:p>
+        </w:tc>
+        <w:tc>
+          <w:tcPr>
+            <w:tcW w:type="dxa" w:w="1701"/>
+          </w:tcPr>
+          <w:p>
+            <w:r/>
+            <w:r>
+              <w:rPr>
+                <w:rFonts w:ascii="Calibri" w:hAnsi="Calibri" w:eastAsia="微软雅黑"/>
+                <w:b/>
+                <w:sz w:val="20"/>
+              </w:rPr>
+              <w:t>日期</w:t>
+            </w:r>
+          </w:p>
+        </w:tc>
+        <w:tc>
+          <w:tcPr>
+            <w:tcW w:type="dxa" w:w="7087"/>
+          </w:tcPr>
+          <w:p>
+            <w:r/>
+            <w:r>
+              <w:rPr>
+                <w:rFonts w:ascii="Calibri" w:hAnsi="Calibri" w:eastAsia="微软雅黑"/>
+                <w:b/>
+                <w:sz w:val="20"/>
+              </w:rPr>
+              <w:t>内容</w:t>
+            </w:r>
+          </w:p>
+        </w:tc>
+      </w:tr>
+      <w:tr>
+        <w:tc>
+          <w:tcPr>
+            <w:tcW w:type="dxa" w:w="1417"/>
+          </w:tcPr>
+          <w:p>
+            <w:r/>
+            <w:r>
+              <w:rPr>
+                <w:rFonts w:ascii="Calibri" w:hAnsi="Calibri" w:eastAsia="微软雅黑"/>
+                <w:sz w:val="19"/>
+              </w:rPr>
+              <w:t>v1.0</w:t>
+            </w:r>
+          </w:p>
+        </w:tc>
+        <w:tc>
+          <w:tcPr>
+            <w:tcW w:type="dxa" w:w="1701"/>
+          </w:tcPr>
+          <w:p>
+            <w:r/>
+            <w:r>
+              <w:rPr>
+                <w:rFonts w:ascii="Calibri" w:hAnsi="Calibri" w:eastAsia="微软雅黑"/>
+                <w:sz w:val="19"/>
+              </w:rPr>
+              <w:t>2026-07-06</w:t>
+            </w:r>
+          </w:p>
+        </w:tc>
+        <w:tc>
+          <w:tcPr>
+            <w:tcW w:type="dxa" w:w="7087"/>
+          </w:tcPr>
+          <w:p>
+            <w:r/>
+            <w:r>
+              <w:rPr>
+                <w:rFonts w:ascii="Calibri" w:hAnsi="Calibri" w:eastAsia="微软雅黑"/>
+                <w:sz w:val="19"/>
+              </w:rPr>
+              <w:t>基于知识库蒸馏稿构建：九级标准+老客户激活矩阵</w:t>
+            </w:r>
+          </w:p>
+        </w:tc>
+      </w:tr>
+      <w:tr>
+        <w:tc>
+          <w:tcPr>
+            <w:tcW w:type="dxa" w:w="1417"/>
+          </w:tcPr>
+          <w:p>
+            <w:r/>
+            <w:r>
+              <w:rPr>
+                <w:rFonts w:ascii="Calibri" w:hAnsi="Calibri" w:eastAsia="微软雅黑"/>
+                <w:sz w:val="19"/>
+              </w:rPr>
+              <w:t>v2.0</w:t>
+            </w:r>
+          </w:p>
+        </w:tc>
+        <w:tc>
+          <w:tcPr>
+            <w:tcW w:type="dxa" w:w="1701"/>
+          </w:tcPr>
+          <w:p>
+            <w:r/>
+            <w:r>
+              <w:rPr>
+                <w:rFonts w:ascii="Calibri" w:hAnsi="Calibri" w:eastAsia="微软雅黑"/>
+                <w:sz w:val="19"/>
+              </w:rPr>
+              <w:t>2026-07-06</w:t>
+            </w:r>
+          </w:p>
+        </w:tc>
+        <w:tc>
+          <w:tcPr>
+            <w:tcW w:type="dxa" w:w="7087"/>
+          </w:tcPr>
+          <w:p>
+            <w:r/>
+            <w:r>
+              <w:rPr>
+                <w:rFonts w:ascii="Calibri" w:hAnsi="Calibri" w:eastAsia="微软雅黑"/>
+                <w:sz w:val="19"/>
+              </w:rPr>
+              <w:t>按两份权威规则文档（客户画像筛选话术库+客户判断SOP）100%原文重构；确立"类型→等级→优先级"三步法；新增45场景筛选决策表与13场景激活话术库；跟进节奏精确到小时；补充推导部分明确标注</w:t>
+            </w:r>
+          </w:p>
+        </w:tc>
+      </w:tr>
+    </w:tbl>
+    <w:p>
+      <w:pPr>
+        <w:spacing w:after="40"/>
+      </w:pPr>
     </w:p>
     <w:sectPr>
       <w:pgSz w:w="12240" w:h="15840"/>

</xml_diff>